<commit_message>
content(dissertation-docx): Lampiran D-G figures and the last state of the port chapters
Adds the bab5 redraws, the PT SKF and engine-demo figures for Lampiran D, the
confusion matrices for E and F, and the full-resolution FSM for G, with their
figure-map rows. The chapter and lampiran files are committed as they stand
before the port is archived.
</commit_message>
<xml_diff>
--- a/dissertation-docx/chapters/bab1.docx
+++ b/dissertation-docx/chapters/bab1.docx
@@ -345,7 +345,7 @@
         <w:t xml:space="preserve"> </w:t>
       </w:r>
       <w:r>
-        <w:t xml:space="preserve">Namun pendekatan ini memiliki kelemahan fundamental, di mana komponen yang masih</w:t>
+        <w:t xml:space="preserve">Namun, pendekatan ini memiliki kelemahan fundamental: komponen yang masih</w:t>
       </w:r>
       <w:r>
         <w:t xml:space="preserve"> </w:t>
@@ -401,7 +401,7 @@
         <w:t xml:space="preserve"> </w:t>
       </w:r>
       <w:r>
-        <w:t xml:space="preserve">yang bersifat prediktif, di mana intervensi dilakukan berdasarkan kondisi</w:t>
+        <w:t xml:space="preserve">yang bersifat prediktif, yaitu intervensi dilakukan berdasarkan kondisi</w:t>
       </w:r>
       <w:r>
         <w:t xml:space="preserve"> </w:t>
@@ -2557,13 +2557,13 @@
         <w:t xml:space="preserve"> </w:t>
       </w:r>
       <w:r>
-        <w:t xml:space="preserve">Namun, interpretabilitas internal WDCNN—fitur mana dari sinyal yang</w:t>
-      </w:r>
-      <w:r>
-        <w:t xml:space="preserve"> </w:t>
-      </w:r>
-      <w:r>
-        <w:t xml:space="preserve">mendorong klasifikasi—belum dikaji secara sistematis dengan metode XAI</w:t>
+        <w:t xml:space="preserve">Namun, interpretabilitas internal WDCNN, yaitu fitur mana dari sinyal yang</w:t>
+      </w:r>
+      <w:r>
+        <w:t xml:space="preserve"> </w:t>
+      </w:r>
+      <w:r>
+        <w:t xml:space="preserve">mendorong klasifikasi, belum dikaji secara sistematis dengan metode XAI</w:t>
       </w:r>
       <w:r>
         <w:t xml:space="preserve"> </w:t>
@@ -2736,7 +2736,7 @@
         <w:t xml:space="preserve">deep learning</w:t>
       </w:r>
       <w:r>
-        <w:t xml:space="preserve">—LSTM</w:t>
+        <w:t xml:space="preserve">: LSTM</w:t>
       </w:r>
       <w:r>
         <w:t xml:space="preserve"> </w:t>
@@ -2980,7 +2980,7 @@
         <w:t xml:space="preserve"> </w:t>
       </w:r>
       <w:r>
-        <w:t xml:space="preserve">perawatan—</w:t>
+        <w:t xml:space="preserve">perawatan, </w:t>
       </w:r>
       <w:r>
         <w:rPr>
@@ -3004,7 +3004,7 @@
         <w:t xml:space="preserve">BPFO?”</w:t>
       </w:r>
       <w:r>
-        <w:t xml:space="preserve">—tidak dapat dijawab secara kuantitatif.</w:t>
+        <w:t xml:space="preserve">, tidak dapat dijawab secara kuantitatif.</w:t>
       </w:r>
       <w:r>
         <w:t xml:space="preserve"> </w:t>
@@ -3226,7 +3226,7 @@
         <w:t xml:space="preserve"> </w:t>
       </w:r>
       <w:r>
-        <w:t xml:space="preserve">belum dilaporkan secara komprehensif.</w:t>
+        <w:t xml:space="preserve">belum dilaporkan secara menyeluruh.</w:t>
       </w:r>
       <w:r>
         <w:t xml:space="preserve"> </w:t>
@@ -3358,6 +3358,11 @@
       <w:r>
         <w:t xml:space="preserve">Conf 1 dan Conf 2 (konferensi pendukung), J 1 (FSM), J 2 (SAE-BPFx).</w:t>
       </w:r>
+    </w:p>
+    <w:p>
+      <w:pPr>
+        <w:pStyle w:val="Paragraf"/>
+      </w:pPr>
     </w:p>
     <w:tbl>
       <w:tblPr>
@@ -3366,6 +3371,14 @@
         <w:tblLook w:firstRow="1" w:lastRow="0" w:firstColumn="0" w:lastColumn="0" w:noHBand="0" w:noVBand="0" w:val="0020"/>
         <w:tblCaption w:val="Posisi penelitian disertasi ini relatif terhadap literatur terdahulu pada sembilan dimensi kritis. Tanda kurung di kolom kontribusi menunjukkan sumber empiris internal: Conf 1 dan Conf 2 (konferensi pendukung), J 1 (FSM), J 2 (SAE-BPFx)."/>
         <w:tblLayout w:type="fixed"/>
+        <w:tblBorders>
+          <w:top w:val="single" w:sz="4" w:space="0" w:color="auto"/>
+          <w:left w:val="single" w:sz="4" w:space="0" w:color="auto"/>
+          <w:bottom w:val="single" w:sz="4" w:space="0" w:color="auto"/>
+          <w:right w:val="single" w:sz="4" w:space="0" w:color="auto"/>
+          <w:insideH w:val="single" w:sz="4" w:space="0" w:color="auto"/>
+          <w:insideV w:val="single" w:sz="4" w:space="0" w:color="auto"/>
+        </w:tblBorders>
       </w:tblPr>
       <w:tblGrid>
         <w:gridCol w:w="1408"/>
@@ -3913,7 +3926,7 @@
               <w:t xml:space="preserve"> </w:t>
             </w:r>
             <w:r>
-              <w:t xml:space="preserve">kuantitatif —</w:t>
+              <w:t xml:space="preserve">kuantitatif,</w:t>
             </w:r>
             <w:r>
               <w:t xml:space="preserve"> </w:t>
@@ -3984,7 +3997,7 @@
               <w:t xml:space="preserve"> </w:t>
             </w:r>
             <w:r>
-              <w:t xml:space="preserve">— plus ablasi</w:t>
+              <w:t xml:space="preserve">, plus ablasi</w:t>
             </w:r>
             <w:r>
               <w:t xml:space="preserve"> </w:t>
@@ -5000,7 +5013,7 @@
         <w:t xml:space="preserve"> </w:t>
       </w:r>
       <w:r>
-        <w:t xml:space="preserve">Suharto dan lainnya</w:t>
+        <w:t xml:space="preserve">Suharto dkk.</w:t>
       </w:r>
       <w:r>
         <w:t xml:space="preserve"> </w:t>
@@ -5021,7 +5034,7 @@
         <w:t xml:space="preserve"> </w:t>
       </w:r>
       <w:r>
-        <w:t xml:space="preserve">Suharto dan lainnya</w:t>
+        <w:t xml:space="preserve">Suharto dkk.</w:t>
       </w:r>
       <w:r>
         <w:t xml:space="preserve"> </w:t>
@@ -5910,7 +5923,7 @@
         <w:t xml:space="preserve">(</w:t>
       </w:r>
       <w:r>
-        <w:t xml:space="preserve">Suharto dan lainnya</w:t>
+        <w:t xml:space="preserve">Suharto dkk.</w:t>
       </w:r>
       <w:r>
         <w:t xml:space="preserve">, 2025)</w:t>
@@ -6150,7 +6163,7 @@
         <w:t xml:space="preserve"> </w:t>
       </w:r>
       <w:r>
-        <w:t xml:space="preserve">Suharto dan lainnya</w:t>
+        <w:t xml:space="preserve">Suharto dkk.</w:t>
       </w:r>
       <w:r>
         <w:t xml:space="preserve">, 2024)</w:t>
@@ -6258,7 +6271,7 @@
         <w:t xml:space="preserve"> </w:t>
       </w:r>
       <w:r>
-        <w:t xml:space="preserve">sumber terbuka—</w:t>
+        <w:t xml:space="preserve">sumber terbuka, </w:t>
       </w:r>
       <w:r>
         <w:rPr>
@@ -6271,7 +6284,7 @@
         <w:t xml:space="preserve"> </w:t>
       </w:r>
       <w:r>
-        <w:t xml:space="preserve">reproduksi, bobot model, dan skrip evaluasi statistik—yang</w:t>
+        <w:t xml:space="preserve">reproduksi, bobot model, dan skrip evaluasi statistik, yang</w:t>
       </w:r>
       <w:r>
         <w:t xml:space="preserve"> </w:t>
@@ -6643,7 +6656,7 @@
         <w:t xml:space="preserve">(</w:t>
       </w:r>
       <w:r>
-        <w:t xml:space="preserve">Suharto dan lainnya</w:t>
+        <w:t xml:space="preserve">Suharto dkk.</w:t>
       </w:r>
       <w:r>
         <w:t xml:space="preserve">, 2025)</w:t>
@@ -6755,7 +6768,7 @@
         <w:t xml:space="preserve"> </w:t>
       </w:r>
       <w:r>
-        <w:t xml:space="preserve">RUL—Mamba-xLSTM, N-BEATS-xLSTM, SparseGate-TCN—dan</w:t>
+        <w:t xml:space="preserve">RUL (Mamba-xLSTM, N-BEATS-xLSTM, dan SparseGate-TCN) dan</w:t>
       </w:r>
       <w:r>
         <w:t xml:space="preserve"> </w:t>
@@ -7275,7 +7288,7 @@
         <w:t xml:space="preserve"> </w:t>
       </w:r>
       <w:r>
-        <w:t xml:space="preserve">Arsitektur multi-tier bersifat konseptual—sebagai cetak biru—namun</w:t>
+        <w:t xml:space="preserve">Arsitektur multi-tier bersifat konseptual, sebagai cetak biru, namun</w:t>
       </w:r>
       <w:r>
         <w:t xml:space="preserve"> </w:t>
@@ -7529,7 +7542,7 @@
         <w:t xml:space="preserve">gap</w:t>
       </w:r>
       <w:r>
-        <w:t xml:space="preserve">) yang teridentifikasi—interpretabilitas sinyal</w:t>
+        <w:t xml:space="preserve">) yang teridentifikasi, yaitu interpretabilitas sinyal</w:t>
       </w:r>
       <w:r>
         <w:t xml:space="preserve"> </w:t>
@@ -7541,7 +7554,7 @@
         <w:t xml:space="preserve"> </w:t>
       </w:r>
       <w:r>
-        <w:t xml:space="preserve">prognostik—menjadi landasan perumusan tiga butir rumusan masalah pada</w:t>
+        <w:t xml:space="preserve">prognostik, menjadi landasan perumusan tiga butir rumusan masalah pada</w:t>
       </w:r>
       <w:r>
         <w:t xml:space="preserve"> </w:t>
@@ -8686,7 +8699,7 @@
         <w:t xml:space="preserve"> </w:t>
       </w:r>
       <w:r>
-        <w:t xml:space="preserve">(Edge IoT — Edge Server — Cloud/GPU) yang dapat diadopsi pada</w:t>
+        <w:t xml:space="preserve">(Edge IoT, Edge Server, hingga Cloud/GPU) yang dapat diadopsi pada</w:t>
       </w:r>
       <w:r>
         <w:t xml:space="preserve"> </w:t>
@@ -8791,7 +8804,7 @@
         <w:t xml:space="preserve"> </w:t>
       </w:r>
       <w:r>
-        <w:t xml:space="preserve">lanjutan—termasuk integrasi data kualitas produk</w:t>
+        <w:t xml:space="preserve">lanjutan, termasuk integrasi data kualitas produk</w:t>
       </w:r>
       <w:r>
         <w:t xml:space="preserve"> </w:t>
@@ -8865,7 +8878,7 @@
         <w:t xml:space="preserve"> </w:t>
       </w:r>
       <w:r>
-        <w:t xml:space="preserve">Kajian literatur dilakukan secara komprehensif terhadap lebih dari</w:t>
+        <w:t xml:space="preserve">Kajian literatur dilakukan secara menyeluruh terhadap lebih dari</w:t>
       </w:r>
       <w:r>
         <w:t xml:space="preserve"> </w:t>
@@ -9956,7 +9969,7 @@
         <w:t xml:space="preserve"> </w:t>
       </w:r>
       <w:r>
-        <w:t xml:space="preserve">dari satu tahap—misalnya identifikasi celah interpretabilitas pada hasil</w:t>
+        <w:t xml:space="preserve">dari satu tahap, misalnya identifikasi celah interpretabilitas pada hasil</w:t>
       </w:r>
       <w:r>
         <w:t xml:space="preserve"> </w:t>
@@ -9969,7 +9982,7 @@
         <w:t xml:space="preserve">benchmark</w:t>
       </w:r>
       <w:r>
-        <w:t xml:space="preserve">—menjadi masukan yang memperketat rancangan tahap</w:t>
+        <w:t xml:space="preserve">, menjadi masukan yang memperketat rancangan tahap</w:t>
       </w:r>
       <w:r>
         <w:t xml:space="preserve"> </w:t>

</xml_diff>